<commit_message>
Enhance resume formatting and styling; improve section headers, paragraphs, and bullet points for better readability and control over page breaks
</commit_message>
<xml_diff>
--- a/Yousif_Abozid_Resume.docx
+++ b/Yousif_Abozid_Resume.docx
@@ -9,32 +9,34 @@
         <w:tblLook w:firstColumn="1" w:firstRow="1" w:lastColumn="0" w:lastRow="0" w:noHBand="0" w:noVBand="1" w:val="04A0"/>
       </w:tblPr>
       <w:tblGrid>
-        <w:gridCol w:w="9936"/>
+        <w:gridCol w:w="10224"/>
       </w:tblGrid>
       <w:tr>
         <w:tc>
           <w:tcPr>
-            <w:tcW w:type="dxa" w:w="9936"/>
+            <w:tcW w:type="dxa" w:w="10224"/>
             <w:shd w:fill="f8f9fa"/>
           </w:tcPr>
           <w:p>
             <w:pPr>
-              <w:spacing w:before="160" w:after="160"/>
+              <w:spacing w:before="120" w:after="120"/>
               <w:jc w:val="center"/>
             </w:pPr>
             <w:r>
               <w:rPr>
                 <w:b/>
                 <w:color w:val="1F4E79"/>
-                <w:sz w:val="36"/>
+                <w:sz w:val="32"/>
               </w:rPr>
+              <w:br/>
               <w:t>Yousif Abozid</w:t>
             </w:r>
             <w:r>
               <w:rPr>
                 <w:color w:val="2C3E50"/>
-                <w:sz w:val="26"/>
+                <w:sz w:val="24"/>
               </w:rPr>
+              <w:br/>
               <w:br/>
               <w:t>Software Engineer</w:t>
             </w:r>
@@ -44,7 +46,7 @@
     </w:tbl>
     <w:p>
       <w:pPr>
-        <w:spacing w:after="320" w:before="160"/>
+        <w:spacing w:after="240" w:before="120"/>
         <w:jc w:val="center"/>
       </w:pPr>
       <w:hyperlink r:id="rId9">
@@ -59,7 +61,7 @@
       <w:r>
         <w:rPr>
           <w:color w:val="1F4E79"/>
-          <w:sz w:val="21"/>
+          <w:sz w:val="20"/>
         </w:rPr>
         <w:t xml:space="preserve"> ● </w:t>
       </w:r>
@@ -75,19 +77,32 @@
       <w:r>
         <w:rPr>
           <w:color w:val="1F4E79"/>
-          <w:sz w:val="21"/>
+          <w:sz w:val="20"/>
         </w:rPr>
         <w:t xml:space="preserve"> ● </w:t>
       </w:r>
       <w:r>
         <w:rPr>
-          <w:sz w:val="21"/>
+          <w:sz w:val="20"/>
         </w:rPr>
         <w:t>Cairo, Egypt</w:t>
       </w:r>
       <w:r>
         <w:rPr>
-          <w:sz w:val="21"/>
+          <w:color w:val="1F4E79"/>
+          <w:sz w:val="20"/>
+        </w:rPr>
+        <w:t xml:space="preserve"> ● </w:t>
+      </w:r>
+      <w:r>
+        <w:rPr>
+          <w:sz w:val="20"/>
+        </w:rPr>
+        <w:t>He/Him</w:t>
+      </w:r>
+      <w:r>
+        <w:rPr>
+          <w:sz w:val="20"/>
         </w:rPr>
         <w:br/>
       </w:r>
@@ -103,7 +118,7 @@
       <w:r>
         <w:rPr>
           <w:color w:val="1F4E79"/>
-          <w:sz w:val="21"/>
+          <w:sz w:val="20"/>
         </w:rPr>
         <w:t xml:space="preserve"> ● </w:t>
       </w:r>
@@ -119,7 +134,7 @@
       <w:r>
         <w:rPr>
           <w:color w:val="1F4E79"/>
-          <w:sz w:val="21"/>
+          <w:sz w:val="20"/>
         </w:rPr>
         <w:t xml:space="preserve"> ● </w:t>
       </w:r>
@@ -135,7 +150,7 @@
       <w:r>
         <w:rPr>
           <w:color w:val="1F4E79"/>
-          <w:sz w:val="21"/>
+          <w:sz w:val="20"/>
         </w:rPr>
         <w:t xml:space="preserve"> ● </w:t>
       </w:r>
@@ -148,23 +163,11 @@
           <w:t>Telegram</w:t>
         </w:r>
       </w:hyperlink>
-      <w:r>
-        <w:rPr>
-          <w:color w:val="1F4E79"/>
-          <w:sz w:val="21"/>
-        </w:rPr>
-        <w:t xml:space="preserve"> ● </w:t>
-      </w:r>
-      <w:r>
-        <w:rPr>
-          <w:sz w:val="21"/>
-        </w:rPr>
-        <w:t>He/Him</w:t>
-      </w:r>
     </w:p>
     <w:p>
       <w:pPr>
-        <w:spacing w:before="240" w:after="120"/>
+        <w:keepNext/>
+        <w:spacing w:before="200" w:after="120"/>
         <w:ind w:left="0" w:right="0"/>
         <w:jc w:val="left"/>
       </w:pPr>
@@ -172,7 +175,7 @@
         <w:rPr>
           <w:b/>
           <w:color w:val="1F4E79"/>
-          <w:sz w:val="26"/>
+          <w:sz w:val="25"/>
           <w:u w:val="single"/>
         </w:rPr>
         <w:t>Summary</w:t>
@@ -180,44 +183,34 @@
     </w:p>
     <w:p>
       <w:pPr>
-        <w:spacing w:before="0" w:after="160"/>
+        <w:spacing w:before="0" w:after="120"/>
       </w:pPr>
       <w:r>
         <w:rPr>
           <w:color w:val="E0E0E0"/>
           <w:sz w:val="16"/>
         </w:rPr>
-        <w:t>━━━━━━━━━━━━━━━━━━━━━━━━━━━━━━━━━━━━━━━━━━━━━━━━━━━━━━━━━━━━</w:t>
+        <w:t>━━━━━━━━━━━━━━━━━━━━━━━━━━━━━━━━━━━━━━━━━━━━━━━━━━</w:t>
       </w:r>
     </w:p>
-    <w:tbl>
-      <w:tblPr>
-        <w:tblW w:type="auto" w:w="0"/>
-        <w:tblLook w:firstColumn="1" w:firstRow="1" w:lastColumn="0" w:lastRow="0" w:noHBand="0" w:noVBand="1" w:val="04A0"/>
-      </w:tblPr>
-      <w:tblGrid>
-        <w:gridCol w:w="9936"/>
-      </w:tblGrid>
-      <w:tr>
-        <w:tc>
-          <w:tcPr>
-            <w:tcW w:type="dxa" w:w="9936"/>
-            <w:shd w:fill="f8f9fa"/>
-          </w:tcPr>
-          <w:p>
-            <w:r>
-              <w:rPr>
-                <w:sz w:val="22"/>
-              </w:rPr>
-              <w:t>Self-taught software engineer trained through rigorous programs including Udacity, Helsinki University, Holberton School, and ALX Africa. Passionate about solving complex problems and crafting efficient, elegant software solutions. A lifelong learner thriving in dynamic environments and contributing to high-impact engineering projects.</w:t>
-            </w:r>
-          </w:p>
-        </w:tc>
-      </w:tr>
-    </w:tbl>
     <w:p>
       <w:pPr>
-        <w:spacing w:before="240" w:after="120"/>
+        <w:spacing w:before="0" w:after="60" w:lineRule="exact" w:line="260"/>
+        <w:ind w:left="0"/>
+      </w:pPr>
+      <w:r>
+        <w:rPr>
+          <w:b w:val="0"/>
+          <w:i w:val="0"/>
+          <w:sz w:val="21"/>
+        </w:rPr>
+        <w:t>Self-taught software engineer trained through rigorous programs including Udacity, Helsinki University, Holberton School, and ALX Africa. Passionate about solving complex problems and crafting efficient, elegant software solutions. A lifelong learner thriving in dynamic environments and contributing to high-impact engineering projects.</w:t>
+      </w:r>
+    </w:p>
+    <w:p>
+      <w:pPr>
+        <w:keepNext/>
+        <w:spacing w:before="200" w:after="120"/>
         <w:ind w:left="0" w:right="0"/>
         <w:jc w:val="left"/>
       </w:pPr>
@@ -225,7 +218,7 @@
         <w:rPr>
           <w:b/>
           <w:color w:val="1F4E79"/>
-          <w:sz w:val="26"/>
+          <w:sz w:val="25"/>
           <w:u w:val="single"/>
         </w:rPr>
         <w:t>Experience</w:t>
@@ -233,19 +226,208 @@
     </w:p>
     <w:p>
       <w:pPr>
-        <w:spacing w:before="0" w:after="160"/>
+        <w:spacing w:before="0" w:after="120"/>
       </w:pPr>
       <w:r>
         <w:rPr>
           <w:color w:val="E0E0E0"/>
           <w:sz w:val="16"/>
         </w:rPr>
-        <w:t>━━━━━━━━━━━━━━━━━━━━━━━━━━━━━━━━━━━━━━━━━━━━━━━━━━━━━━━━━━━━</w:t>
+        <w:t>━━━━━━━━━━━━━━━━━━━━━━━━━━━━━━━━━━━━━━━━━━━━━━━━━━</w:t>
       </w:r>
     </w:p>
     <w:p>
       <w:pPr>
-        <w:spacing w:before="0" w:after="80" w:lineRule="exact" w:line="280"/>
+        <w:keepNext/>
+        <w:spacing w:before="0" w:after="60" w:lineRule="exact" w:line="260"/>
+        <w:ind w:left="0"/>
+      </w:pPr>
+      <w:r>
+        <w:rPr>
+          <w:b/>
+          <w:i w:val="0"/>
+          <w:color w:val="2C3E50"/>
+          <w:sz w:val="23"/>
+        </w:rPr>
+        <w:t>Senior Frontend Developer — Equivator</w:t>
+      </w:r>
+    </w:p>
+    <w:p>
+      <w:pPr>
+        <w:keepNext/>
+        <w:spacing w:before="0" w:after="60" w:lineRule="exact" w:line="260"/>
+        <w:ind w:left="0"/>
+      </w:pPr>
+      <w:r>
+        <w:rPr>
+          <w:b w:val="0"/>
+          <w:i/>
+          <w:color w:val="6C757D"/>
+          <w:sz w:val="20"/>
+        </w:rPr>
+        <w:t>Riyadh, Saudi Arabia - Remote | 09/2025 – 12/2025</w:t>
+      </w:r>
+    </w:p>
+    <w:p>
+      <w:pPr>
+        <w:keepNext/>
+        <w:spacing w:before="0" w:after="40" w:lineRule="exact" w:line="260"/>
+        <w:ind w:left="288" w:hanging="216"/>
+      </w:pPr>
+      <w:r>
+        <w:rPr>
+          <w:color w:val="1F4E79"/>
+          <w:sz w:val="20"/>
+        </w:rPr>
+      </w:r>
+      <w:r>
+        <w:rPr>
+          <w:sz w:val="21"/>
+        </w:rPr>
+        <w:t xml:space="preserve"> • Led development of two full-scale web apps (Admin + Partner) for a construction management platform.</w:t>
+      </w:r>
+    </w:p>
+    <w:p>
+      <w:pPr>
+        <w:keepNext/>
+        <w:spacing w:before="0" w:after="40" w:lineRule="exact" w:line="260"/>
+        <w:ind w:left="288" w:hanging="216"/>
+      </w:pPr>
+      <w:r>
+        <w:rPr>
+          <w:color w:val="1F4E79"/>
+          <w:sz w:val="20"/>
+        </w:rPr>
+      </w:r>
+      <w:r>
+        <w:rPr>
+          <w:sz w:val="21"/>
+        </w:rPr>
+        <w:t xml:space="preserve"> • Architected and maintained a scalable monorepo (Turborepo + PNPM) with shared UI packages and internal tooling.</w:t>
+      </w:r>
+    </w:p>
+    <w:p>
+      <w:pPr>
+        <w:keepNext/>
+        <w:spacing w:before="0" w:after="40" w:lineRule="exact" w:line="260"/>
+        <w:ind w:left="288" w:hanging="216"/>
+      </w:pPr>
+      <w:r>
+        <w:rPr>
+          <w:color w:val="1F4E79"/>
+          <w:sz w:val="20"/>
+        </w:rPr>
+      </w:r>
+      <w:r>
+        <w:rPr>
+          <w:sz w:val="21"/>
+        </w:rPr>
+        <w:t xml:space="preserve"> • Implemented material/equipment inquiries, quotation workflows, project management, and supplier onboarding modules.</w:t>
+      </w:r>
+    </w:p>
+    <w:p>
+      <w:pPr>
+        <w:keepNext/>
+        <w:spacing w:before="0" w:after="40" w:lineRule="exact" w:line="260"/>
+        <w:ind w:left="288" w:hanging="216"/>
+      </w:pPr>
+      <w:r>
+        <w:rPr>
+          <w:color w:val="1F4E79"/>
+          <w:sz w:val="20"/>
+        </w:rPr>
+      </w:r>
+      <w:r>
+        <w:rPr>
+          <w:sz w:val="21"/>
+        </w:rPr>
+        <w:t xml:space="preserve"> • Built a robust, cross-app notifications system supporting real-time and event-driven business flows.</w:t>
+      </w:r>
+    </w:p>
+    <w:p>
+      <w:pPr>
+        <w:keepNext/>
+        <w:spacing w:before="0" w:after="40" w:lineRule="exact" w:line="260"/>
+        <w:ind w:left="288" w:hanging="216"/>
+      </w:pPr>
+      <w:r>
+        <w:rPr>
+          <w:color w:val="1F4E79"/>
+          <w:sz w:val="20"/>
+        </w:rPr>
+      </w:r>
+      <w:r>
+        <w:rPr>
+          <w:sz w:val="21"/>
+        </w:rPr>
+        <w:t xml:space="preserve"> • Collaborated with distributed teams (UI/UX, backend, QA) across Egypt, Syria, Turkey, and UAE to deliver production-ready features.</w:t>
+      </w:r>
+    </w:p>
+    <w:p>
+      <w:pPr>
+        <w:keepNext/>
+        <w:spacing w:before="0" w:after="40" w:lineRule="exact" w:line="260"/>
+        <w:ind w:left="288" w:hanging="216"/>
+      </w:pPr>
+      <w:r>
+        <w:rPr>
+          <w:color w:val="1F4E79"/>
+          <w:sz w:val="20"/>
+        </w:rPr>
+      </w:r>
+      <w:r>
+        <w:rPr>
+          <w:sz w:val="21"/>
+        </w:rPr>
+        <w:t xml:space="preserve"> • Delivered type-safe API integrations using automated OpenAPI client generation.</w:t>
+      </w:r>
+    </w:p>
+    <w:p>
+      <w:pPr>
+        <w:keepNext/>
+        <w:spacing w:before="0" w:after="40" w:lineRule="exact" w:line="260"/>
+        <w:ind w:left="288" w:hanging="216"/>
+      </w:pPr>
+      <w:r>
+        <w:rPr>
+          <w:color w:val="1F4E79"/>
+          <w:sz w:val="20"/>
+        </w:rPr>
+      </w:r>
+      <w:r>
+        <w:rPr>
+          <w:sz w:val="21"/>
+        </w:rPr>
+        <w:t xml:space="preserve"> • Optimized performance, improved build pipelines, and ensured consistent deployments for dev, staging, and demo environments.</w:t>
+      </w:r>
+    </w:p>
+    <w:p>
+      <w:pPr>
+        <w:spacing w:before="0" w:after="40" w:lineRule="exact" w:line="260"/>
+        <w:ind w:left="288" w:hanging="216"/>
+      </w:pPr>
+      <w:r>
+        <w:rPr>
+          <w:color w:val="1F4E79"/>
+          <w:sz w:val="20"/>
+        </w:rPr>
+      </w:r>
+      <w:r>
+        <w:rPr>
+          <w:sz w:val="21"/>
+        </w:rPr>
+        <w:t xml:space="preserve"> • Contributed to design system development, enhancing UX consistency across both applications.</w:t>
+      </w:r>
+    </w:p>
+    <w:p>
+      <w:pPr>
+        <w:spacing w:after="120"/>
+      </w:pPr>
+    </w:p>
+    <w:p>
+      <w:pPr>
+        <w:keepNext/>
+        <w:spacing w:before="0" w:after="60" w:lineRule="exact" w:line="260"/>
         <w:ind w:left="0"/>
       </w:pPr>
       <w:r>
@@ -260,7 +442,8 @@
     </w:p>
     <w:p>
       <w:pPr>
-        <w:spacing w:before="0" w:after="80" w:lineRule="exact" w:line="280"/>
+        <w:keepNext/>
+        <w:spacing w:before="0" w:after="60" w:lineRule="exact" w:line="260"/>
         <w:ind w:left="0"/>
       </w:pPr>
       <w:r>
@@ -275,7 +458,8 @@
     </w:p>
     <w:p>
       <w:pPr>
-        <w:spacing w:before="0" w:after="60" w:lineRule="exact" w:line="280"/>
+        <w:keepNext/>
+        <w:spacing w:before="0" w:after="40" w:lineRule="exact" w:line="260"/>
         <w:ind w:left="288" w:hanging="216"/>
       </w:pPr>
       <w:r>
@@ -288,12 +472,13 @@
         <w:rPr>
           <w:sz w:val="21"/>
         </w:rPr>
-        <w:t>• Developed Bruno, a trading platform used by 10K+ users, using React, Tailwind CSS, and Redux.</w:t>
+        <w:t xml:space="preserve"> • Developed Bruno, a trading platform used by 10K+ users, using React, Tailwind CSS, and Redux.</w:t>
       </w:r>
     </w:p>
     <w:p>
       <w:pPr>
-        <w:spacing w:before="0" w:after="60" w:lineRule="exact" w:line="280"/>
+        <w:keepNext/>
+        <w:spacing w:before="0" w:after="40" w:lineRule="exact" w:line="260"/>
         <w:ind w:left="288" w:hanging="216"/>
       </w:pPr>
       <w:r>
@@ -306,12 +491,13 @@
         <w:rPr>
           <w:sz w:val="21"/>
         </w:rPr>
-        <w:t>• Increased platform performance by 60% through modularization and advanced hooks.</w:t>
+        <w:t xml:space="preserve"> • Increased platform performance by 60% through modularization and advanced hooks.</w:t>
       </w:r>
     </w:p>
     <w:p>
       <w:pPr>
-        <w:spacing w:before="0" w:after="60" w:lineRule="exact" w:line="280"/>
+        <w:keepNext/>
+        <w:spacing w:before="0" w:after="40" w:lineRule="exact" w:line="260"/>
         <w:ind w:left="288" w:hanging="216"/>
       </w:pPr>
       <w:r>
@@ -324,12 +510,13 @@
         <w:rPr>
           <w:sz w:val="21"/>
         </w:rPr>
-        <w:t>• Integrated biometric authentication (Face ID/Fingerprint) across iOS &amp; Android builds.</w:t>
+        <w:t xml:space="preserve"> • Integrated biometric authentication (Face ID/Fingerprint) across iOS &amp; Android builds.</w:t>
       </w:r>
     </w:p>
     <w:p>
       <w:pPr>
-        <w:spacing w:before="0" w:after="60" w:lineRule="exact" w:line="280"/>
+        <w:keepNext/>
+        <w:spacing w:before="0" w:after="40" w:lineRule="exact" w:line="260"/>
         <w:ind w:left="288" w:hanging="216"/>
       </w:pPr>
       <w:r>
@@ -342,12 +529,13 @@
         <w:rPr>
           <w:sz w:val="21"/>
         </w:rPr>
-        <w:t>• Delivered ERP system managing 500+ client accounts and permissions with React Query and REST APIs.</w:t>
+        <w:t xml:space="preserve"> • Delivered ERP system managing 500+ client accounts and permissions with React Query and REST APIs.</w:t>
       </w:r>
     </w:p>
     <w:p>
       <w:pPr>
-        <w:spacing w:before="0" w:after="60" w:lineRule="exact" w:line="280"/>
+        <w:keepNext/>
+        <w:spacing w:before="0" w:after="40" w:lineRule="exact" w:line="260"/>
         <w:ind w:left="288" w:hanging="216"/>
       </w:pPr>
       <w:r>
@@ -360,12 +548,13 @@
         <w:rPr>
           <w:sz w:val="21"/>
         </w:rPr>
-        <w:t>• Reduced frontend defects by 40% after refactoring legacy code into reusable components.</w:t>
+        <w:t xml:space="preserve"> • Reduced frontend defects by 40% after refactoring legacy code into reusable components.</w:t>
       </w:r>
     </w:p>
     <w:p>
       <w:pPr>
-        <w:spacing w:before="0" w:after="60" w:lineRule="exact" w:line="280"/>
+        <w:keepNext/>
+        <w:spacing w:before="0" w:after="40" w:lineRule="exact" w:line="260"/>
         <w:ind w:left="288" w:hanging="216"/>
       </w:pPr>
       <w:r>
@@ -378,12 +567,13 @@
         <w:rPr>
           <w:sz w:val="21"/>
         </w:rPr>
-        <w:t>• Coordinated with cross-functional teams to launch 20+ features across 3 fintech products.</w:t>
+        <w:t xml:space="preserve"> • Coordinated with cross-functional teams to launch 20+ features across 3 fintech products.</w:t>
       </w:r>
     </w:p>
     <w:p>
       <w:pPr>
-        <w:spacing w:before="0" w:after="60" w:lineRule="exact" w:line="280"/>
+        <w:keepNext/>
+        <w:spacing w:before="0" w:after="40" w:lineRule="exact" w:line="260"/>
         <w:ind w:left="288" w:hanging="216"/>
       </w:pPr>
       <w:r>
@@ -396,12 +586,12 @@
         <w:rPr>
           <w:sz w:val="21"/>
         </w:rPr>
-        <w:t>• Provided mentorship to junior developers and onboarding support to new hires.</w:t>
+        <w:t xml:space="preserve"> • Provided mentorship to junior developers and onboarding support to new hires.</w:t>
       </w:r>
     </w:p>
     <w:p>
       <w:pPr>
-        <w:spacing w:before="0" w:after="60" w:lineRule="exact" w:line="280"/>
+        <w:spacing w:before="0" w:after="40" w:lineRule="exact" w:line="260"/>
         <w:ind w:left="288" w:hanging="216"/>
       </w:pPr>
       <w:r>
@@ -414,7 +604,7 @@
         <w:rPr>
           <w:sz w:val="21"/>
         </w:rPr>
-        <w:t>• Partnered directly with CEO on strategic feature roadmap and market fit goals.</w:t>
+        <w:t xml:space="preserve"> • Partnered directly with CEO on strategic feature roadmap and market fit goals.</w:t>
       </w:r>
     </w:p>
     <w:p>
@@ -424,7 +614,8 @@
     </w:p>
     <w:p>
       <w:pPr>
-        <w:spacing w:before="0" w:after="80" w:lineRule="exact" w:line="280"/>
+        <w:keepNext/>
+        <w:spacing w:before="0" w:after="60" w:lineRule="exact" w:line="260"/>
         <w:ind w:left="0"/>
       </w:pPr>
       <w:r>
@@ -439,7 +630,8 @@
     </w:p>
     <w:p>
       <w:pPr>
-        <w:spacing w:before="0" w:after="80" w:lineRule="exact" w:line="280"/>
+        <w:keepNext/>
+        <w:spacing w:before="0" w:after="60" w:lineRule="exact" w:line="260"/>
         <w:ind w:left="0"/>
       </w:pPr>
       <w:r>
@@ -454,7 +646,8 @@
     </w:p>
     <w:p>
       <w:pPr>
-        <w:spacing w:before="0" w:after="60" w:lineRule="exact" w:line="280"/>
+        <w:keepNext/>
+        <w:spacing w:before="0" w:after="40" w:lineRule="exact" w:line="260"/>
         <w:ind w:left="288" w:hanging="216"/>
       </w:pPr>
       <w:r>
@@ -467,12 +660,13 @@
         <w:rPr>
           <w:sz w:val="21"/>
         </w:rPr>
-        <w:t>• Built insurance issuance system increasing processing efficiency by 80%.</w:t>
+        <w:t xml:space="preserve"> • Built insurance issuance system increasing processing efficiency by 80%.</w:t>
       </w:r>
     </w:p>
     <w:p>
       <w:pPr>
-        <w:spacing w:before="0" w:after="60" w:lineRule="exact" w:line="280"/>
+        <w:keepNext/>
+        <w:spacing w:before="0" w:after="40" w:lineRule="exact" w:line="260"/>
         <w:ind w:left="288" w:hanging="216"/>
       </w:pPr>
       <w:r>
@@ -485,12 +679,13 @@
         <w:rPr>
           <w:sz w:val="21"/>
         </w:rPr>
-        <w:t>• Customized 10+ products to meet specific client requirements.</w:t>
+        <w:t xml:space="preserve"> • Customized 10+ products to meet specific client requirements.</w:t>
       </w:r>
     </w:p>
     <w:p>
       <w:pPr>
-        <w:spacing w:before="0" w:after="60" w:lineRule="exact" w:line="280"/>
+        <w:keepNext/>
+        <w:spacing w:before="0" w:after="40" w:lineRule="exact" w:line="260"/>
         <w:ind w:left="288" w:hanging="216"/>
       </w:pPr>
       <w:r>
@@ -503,12 +698,13 @@
         <w:rPr>
           <w:sz w:val="21"/>
         </w:rPr>
-        <w:t>• Achieved 99.9% uptime by maintaining and improving SISos 11 internal system.</w:t>
+        <w:t xml:space="preserve"> • Achieved 99.9% uptime by maintaining and improving SISos 11 internal system.</w:t>
       </w:r>
     </w:p>
     <w:p>
       <w:pPr>
-        <w:spacing w:before="0" w:after="60" w:lineRule="exact" w:line="280"/>
+        <w:keepNext/>
+        <w:spacing w:before="0" w:after="40" w:lineRule="exact" w:line="260"/>
         <w:ind w:left="288" w:hanging="216"/>
       </w:pPr>
       <w:r>
@@ -521,12 +717,12 @@
         <w:rPr>
           <w:sz w:val="21"/>
         </w:rPr>
-        <w:t>• Produced actionable reports adopted by executive leadership for strategic planning.</w:t>
+        <w:t xml:space="preserve"> • Produced actionable reports adopted by executive leadership for strategic planning.</w:t>
       </w:r>
     </w:p>
     <w:p>
       <w:pPr>
-        <w:spacing w:before="0" w:after="60" w:lineRule="exact" w:line="280"/>
+        <w:spacing w:before="0" w:after="40" w:lineRule="exact" w:line="260"/>
         <w:ind w:left="288" w:hanging="216"/>
       </w:pPr>
       <w:r>
@@ -539,7 +735,7 @@
         <w:rPr>
           <w:sz w:val="21"/>
         </w:rPr>
-        <w:t>• Led modernization of legacy stack, cutting support tickets by 45%.</w:t>
+        <w:t xml:space="preserve"> • Led modernization of legacy stack, cutting support tickets by 45%.</w:t>
       </w:r>
     </w:p>
     <w:p>
@@ -549,7 +745,8 @@
     </w:p>
     <w:p>
       <w:pPr>
-        <w:spacing w:before="0" w:after="80" w:lineRule="exact" w:line="280"/>
+        <w:keepNext/>
+        <w:spacing w:before="0" w:after="60" w:lineRule="exact" w:line="260"/>
         <w:ind w:left="0"/>
       </w:pPr>
       <w:r>
@@ -564,7 +761,8 @@
     </w:p>
     <w:p>
       <w:pPr>
-        <w:spacing w:before="0" w:after="80" w:lineRule="exact" w:line="280"/>
+        <w:keepNext/>
+        <w:spacing w:before="0" w:after="60" w:lineRule="exact" w:line="260"/>
         <w:ind w:left="0"/>
       </w:pPr>
       <w:r>
@@ -579,7 +777,8 @@
     </w:p>
     <w:p>
       <w:pPr>
-        <w:spacing w:before="0" w:after="60" w:lineRule="exact" w:line="280"/>
+        <w:keepNext/>
+        <w:spacing w:before="0" w:after="40" w:lineRule="exact" w:line="260"/>
         <w:ind w:left="288" w:hanging="216"/>
       </w:pPr>
       <w:r>
@@ -592,12 +791,13 @@
         <w:rPr>
           <w:sz w:val="21"/>
         </w:rPr>
-        <w:t>• Completed 50+ projects, including full-stack web apps using React, Node.js, and PostgreSQL.</w:t>
+        <w:t xml:space="preserve"> • Completed 50+ projects, including full-stack web apps using React, Node.js, and PostgreSQL.</w:t>
       </w:r>
     </w:p>
     <w:p>
       <w:pPr>
-        <w:spacing w:before="0" w:after="60" w:lineRule="exact" w:line="280"/>
+        <w:keepNext/>
+        <w:spacing w:before="0" w:after="40" w:lineRule="exact" w:line="260"/>
         <w:ind w:left="288" w:hanging="216"/>
       </w:pPr>
       <w:r>
@@ -610,12 +810,13 @@
         <w:rPr>
           <w:sz w:val="21"/>
         </w:rPr>
-        <w:t>• Mastered 12+ tools across front and backend: TypeScript, GraphQL, AWS, CI/CD, and testing frameworks.</w:t>
+        <w:t xml:space="preserve"> • Mastered 12+ tools across front and backend: TypeScript, GraphQL, AWS, CI/CD, and testing frameworks.</w:t>
       </w:r>
     </w:p>
     <w:p>
       <w:pPr>
-        <w:spacing w:before="0" w:after="60" w:lineRule="exact" w:line="280"/>
+        <w:keepNext/>
+        <w:spacing w:before="0" w:after="40" w:lineRule="exact" w:line="260"/>
         <w:ind w:left="288" w:hanging="216"/>
       </w:pPr>
       <w:r>
@@ -628,12 +829,12 @@
         <w:rPr>
           <w:sz w:val="21"/>
         </w:rPr>
-        <w:t>• Reviewed peer submissions and supported community learning groups weekly.</w:t>
+        <w:t xml:space="preserve"> • Reviewed peer submissions and supported community learning groups weekly.</w:t>
       </w:r>
     </w:p>
     <w:p>
       <w:pPr>
-        <w:spacing w:before="0" w:after="60" w:lineRule="exact" w:line="280"/>
+        <w:spacing w:before="0" w:after="40" w:lineRule="exact" w:line="260"/>
         <w:ind w:left="288" w:hanging="216"/>
       </w:pPr>
       <w:r>
@@ -646,7 +847,7 @@
         <w:rPr>
           <w:sz w:val="21"/>
         </w:rPr>
-        <w:t>• Contributed to production-grade apps featured in ALX engineering showcase.</w:t>
+        <w:t xml:space="preserve"> • Contributed to production-grade apps featured in ALX engineering showcase.</w:t>
       </w:r>
     </w:p>
     <w:p>
@@ -656,7 +857,8 @@
     </w:p>
     <w:p>
       <w:pPr>
-        <w:spacing w:before="0" w:after="80" w:lineRule="exact" w:line="280"/>
+        <w:keepNext/>
+        <w:spacing w:before="0" w:after="60" w:lineRule="exact" w:line="260"/>
         <w:ind w:left="0"/>
       </w:pPr>
       <w:r>
@@ -671,7 +873,8 @@
     </w:p>
     <w:p>
       <w:pPr>
-        <w:spacing w:before="0" w:after="80" w:lineRule="exact" w:line="280"/>
+        <w:keepNext/>
+        <w:spacing w:before="0" w:after="60" w:lineRule="exact" w:line="260"/>
         <w:ind w:left="0"/>
       </w:pPr>
       <w:r>
@@ -686,7 +889,8 @@
     </w:p>
     <w:p>
       <w:pPr>
-        <w:spacing w:before="0" w:after="60" w:lineRule="exact" w:line="280"/>
+        <w:keepNext/>
+        <w:spacing w:before="0" w:after="40" w:lineRule="exact" w:line="260"/>
         <w:ind w:left="288" w:hanging="216"/>
       </w:pPr>
       <w:r>
@@ -699,12 +903,13 @@
         <w:rPr>
           <w:sz w:val="21"/>
         </w:rPr>
-        <w:t>• Built scalable SaaS web app using Next.js and Express.</w:t>
+        <w:t xml:space="preserve"> • Built scalable SaaS web app using Next.js and Express.</w:t>
       </w:r>
     </w:p>
     <w:p>
       <w:pPr>
-        <w:spacing w:before="0" w:after="60" w:lineRule="exact" w:line="280"/>
+        <w:keepNext/>
+        <w:spacing w:before="0" w:after="40" w:lineRule="exact" w:line="260"/>
         <w:ind w:left="288" w:hanging="216"/>
       </w:pPr>
       <w:r>
@@ -717,12 +922,13 @@
         <w:rPr>
           <w:sz w:val="21"/>
         </w:rPr>
-        <w:t>• Decreased feature delivery time by 30% through improved time management.</w:t>
+        <w:t xml:space="preserve"> • Decreased feature delivery time by 30% through improved time management.</w:t>
       </w:r>
     </w:p>
     <w:p>
       <w:pPr>
-        <w:spacing w:before="0" w:after="60" w:lineRule="exact" w:line="280"/>
+        <w:keepNext/>
+        <w:spacing w:before="0" w:after="40" w:lineRule="exact" w:line="260"/>
         <w:ind w:left="288" w:hanging="216"/>
       </w:pPr>
       <w:r>
@@ -735,12 +941,12 @@
         <w:rPr>
           <w:sz w:val="21"/>
         </w:rPr>
-        <w:t>• Owned end-to-end implementation of core modules and database connections.</w:t>
+        <w:t xml:space="preserve"> • Owned end-to-end implementation of core modules and database connections.</w:t>
       </w:r>
     </w:p>
     <w:p>
       <w:pPr>
-        <w:spacing w:before="0" w:after="60" w:lineRule="exact" w:line="280"/>
+        <w:spacing w:before="0" w:after="40" w:lineRule="exact" w:line="260"/>
         <w:ind w:left="288" w:hanging="216"/>
       </w:pPr>
       <w:r>
@@ -753,12 +959,13 @@
         <w:rPr>
           <w:sz w:val="21"/>
         </w:rPr>
-        <w:t>• Participated in Agile sprints and contributed to daily standups and code reviews.</w:t>
+        <w:t xml:space="preserve"> • Participated in Agile sprints and contributed to daily standups and code reviews.</w:t>
       </w:r>
     </w:p>
     <w:p>
       <w:pPr>
-        <w:spacing w:before="240" w:after="120"/>
+        <w:keepNext/>
+        <w:spacing w:before="200" w:after="120"/>
         <w:ind w:left="0" w:right="0"/>
         <w:jc w:val="left"/>
       </w:pPr>
@@ -766,7 +973,7 @@
         <w:rPr>
           <w:b/>
           <w:color w:val="1F4E79"/>
-          <w:sz w:val="26"/>
+          <w:sz w:val="25"/>
           <w:u w:val="single"/>
         </w:rPr>
         <w:t>Education</w:t>
@@ -774,19 +981,20 @@
     </w:p>
     <w:p>
       <w:pPr>
-        <w:spacing w:before="0" w:after="160"/>
+        <w:spacing w:before="0" w:after="120"/>
       </w:pPr>
       <w:r>
         <w:rPr>
           <w:color w:val="E0E0E0"/>
           <w:sz w:val="16"/>
         </w:rPr>
-        <w:t>━━━━━━━━━━━━━━━━━━━━━━━━━━━━━━━━━━━━━━━━━━━━━━━━━━━━━━━━━━━━</w:t>
+        <w:t>━━━━━━━━━━━━━━━━━━━━━━━━━━━━━━━━━━━━━━━━━━━━━━━━━━</w:t>
       </w:r>
     </w:p>
     <w:p>
       <w:pPr>
-        <w:spacing w:before="0" w:after="80" w:lineRule="exact" w:line="280"/>
+        <w:keepNext/>
+        <w:spacing w:before="0" w:after="60" w:lineRule="exact" w:line="260"/>
         <w:ind w:left="0"/>
       </w:pPr>
       <w:r>
@@ -801,7 +1009,7 @@
     </w:p>
     <w:p>
       <w:pPr>
-        <w:spacing w:before="0" w:after="80" w:lineRule="exact" w:line="280"/>
+        <w:spacing w:before="0" w:after="60" w:lineRule="exact" w:line="260"/>
         <w:ind w:left="0"/>
       </w:pPr>
       <w:r>
@@ -816,7 +1024,7 @@
     </w:p>
     <w:p>
       <w:pPr>
-        <w:spacing w:before="0" w:after="80" w:lineRule="exact" w:line="280"/>
+        <w:spacing w:before="0" w:after="60" w:lineRule="exact" w:line="260"/>
         <w:ind w:left="0"/>
       </w:pPr>
       <w:r>
@@ -830,7 +1038,8 @@
     </w:p>
     <w:p>
       <w:pPr>
-        <w:spacing w:before="0" w:after="80" w:lineRule="exact" w:line="280"/>
+        <w:keepNext/>
+        <w:spacing w:before="0" w:after="60" w:lineRule="exact" w:line="260"/>
         <w:ind w:left="0"/>
       </w:pPr>
       <w:r>
@@ -845,7 +1054,7 @@
     </w:p>
     <w:p>
       <w:pPr>
-        <w:spacing w:before="0" w:after="80" w:lineRule="exact" w:line="280"/>
+        <w:spacing w:before="0" w:after="60" w:lineRule="exact" w:line="260"/>
         <w:ind w:left="0"/>
       </w:pPr>
       <w:r>
@@ -860,7 +1069,7 @@
     </w:p>
     <w:p>
       <w:pPr>
-        <w:spacing w:before="0" w:after="80" w:lineRule="exact" w:line="280"/>
+        <w:spacing w:before="0" w:after="60" w:lineRule="exact" w:line="260"/>
         <w:ind w:left="0"/>
       </w:pPr>
       <w:r>
@@ -874,7 +1083,8 @@
     </w:p>
     <w:p>
       <w:pPr>
-        <w:spacing w:before="0" w:after="80" w:lineRule="exact" w:line="280"/>
+        <w:keepNext/>
+        <w:spacing w:before="0" w:after="60" w:lineRule="exact" w:line="260"/>
         <w:ind w:left="0"/>
       </w:pPr>
       <w:r>
@@ -889,7 +1099,7 @@
     </w:p>
     <w:p>
       <w:pPr>
-        <w:spacing w:before="0" w:after="80" w:lineRule="exact" w:line="280"/>
+        <w:spacing w:before="0" w:after="60" w:lineRule="exact" w:line="260"/>
         <w:ind w:left="0"/>
       </w:pPr>
       <w:r>
@@ -904,7 +1114,7 @@
     </w:p>
     <w:p>
       <w:pPr>
-        <w:spacing w:before="0" w:after="80" w:lineRule="exact" w:line="280"/>
+        <w:spacing w:before="0" w:after="60" w:lineRule="exact" w:line="260"/>
         <w:ind w:left="0"/>
       </w:pPr>
       <w:r>
@@ -918,7 +1128,8 @@
     </w:p>
     <w:p>
       <w:pPr>
-        <w:spacing w:before="0" w:after="80" w:lineRule="exact" w:line="280"/>
+        <w:keepNext/>
+        <w:spacing w:before="0" w:after="60" w:lineRule="exact" w:line="260"/>
         <w:ind w:left="0"/>
       </w:pPr>
       <w:r>
@@ -933,7 +1144,7 @@
     </w:p>
     <w:p>
       <w:pPr>
-        <w:spacing w:before="0" w:after="80" w:lineRule="exact" w:line="280"/>
+        <w:spacing w:before="0" w:after="60" w:lineRule="exact" w:line="260"/>
         <w:ind w:left="0"/>
       </w:pPr>
       <w:r>
@@ -948,7 +1159,7 @@
     </w:p>
     <w:p>
       <w:pPr>
-        <w:spacing w:before="0" w:after="80" w:lineRule="exact" w:line="280"/>
+        <w:spacing w:before="0" w:after="60" w:lineRule="exact" w:line="260"/>
         <w:ind w:left="0"/>
       </w:pPr>
       <w:r>
@@ -962,7 +1173,8 @@
     </w:p>
     <w:p>
       <w:pPr>
-        <w:spacing w:before="240" w:after="120"/>
+        <w:keepNext/>
+        <w:spacing w:before="200" w:after="120"/>
         <w:ind w:left="0" w:right="0"/>
         <w:jc w:val="left"/>
       </w:pPr>
@@ -970,7 +1182,7 @@
         <w:rPr>
           <w:b/>
           <w:color w:val="1F4E79"/>
-          <w:sz w:val="26"/>
+          <w:sz w:val="25"/>
           <w:u w:val="single"/>
         </w:rPr>
         <w:t>Projects</w:t>
@@ -978,19 +1190,20 @@
     </w:p>
     <w:p>
       <w:pPr>
-        <w:spacing w:before="0" w:after="160"/>
+        <w:spacing w:before="0" w:after="120"/>
       </w:pPr>
       <w:r>
         <w:rPr>
           <w:color w:val="E0E0E0"/>
           <w:sz w:val="16"/>
         </w:rPr>
-        <w:t>━━━━━━━━━━━━━━━━━━━━━━━━━━━━━━━━━━━━━━━━━━━━━━━━━━━━━━━━━━━━</w:t>
+        <w:t>━━━━━━━━━━━━━━━━━━━━━━━━━━━━━━━━━━━━━━━━━━━━━━━━━━</w:t>
       </w:r>
     </w:p>
     <w:p>
       <w:pPr>
-        <w:spacing w:before="0" w:after="80" w:lineRule="exact" w:line="280"/>
+        <w:keepNext/>
+        <w:spacing w:before="0" w:after="60" w:lineRule="exact" w:line="260"/>
         <w:ind w:left="0"/>
       </w:pPr>
       <w:r>
@@ -1005,7 +1218,7 @@
     </w:p>
     <w:p>
       <w:pPr>
-        <w:spacing w:before="0" w:after="60" w:lineRule="exact" w:line="240"/>
+        <w:spacing w:before="0" w:after="40" w:lineRule="exact" w:line="220"/>
       </w:pPr>
       <w:hyperlink r:id="rId15">
         <w:r>
@@ -1013,16 +1226,16 @@
             <w:color w:val="0563C1"/>
             <w:u w:val="single"/>
           </w:rPr>
-          <w:t>Demo</w:t>
+          <w:t>Live</w:t>
         </w:r>
       </w:hyperlink>
       <w:r>
         <w:rPr>
           <w:b w:val="0"/>
           <w:i w:val="0"/>
-          <w:sz w:val="21"/>
+          <w:sz w:val="20"/>
         </w:rPr>
-        <w:t xml:space="preserve"> │ </w:t>
+        <w:t xml:space="preserve"> | </w:t>
       </w:r>
       <w:hyperlink r:id="rId16">
         <w:r>
@@ -1036,7 +1249,8 @@
     </w:p>
     <w:p>
       <w:pPr>
-        <w:spacing w:before="0" w:after="60" w:lineRule="exact" w:line="280"/>
+        <w:keepNext/>
+        <w:spacing w:before="0" w:after="40" w:lineRule="exact" w:line="260"/>
         <w:ind w:left="288" w:hanging="216"/>
       </w:pPr>
       <w:r>
@@ -1049,12 +1263,13 @@
         <w:rPr>
           <w:sz w:val="21"/>
         </w:rPr>
-        <w:t>• Built comprehensive GitHub analytics platform with React 19, TypeScript, and Tailwind CSS v4.</w:t>
+        <w:t xml:space="preserve"> • Built comprehensive GitHub analytics platform with React 19, TypeScript, and Tailwind CSS v4.</w:t>
       </w:r>
     </w:p>
     <w:p>
       <w:pPr>
-        <w:spacing w:before="0" w:after="60" w:lineRule="exact" w:line="280"/>
+        <w:keepNext/>
+        <w:spacing w:before="0" w:after="40" w:lineRule="exact" w:line="260"/>
         <w:ind w:left="288" w:hanging="216"/>
       </w:pPr>
       <w:r>
@@ -1067,12 +1282,13 @@
         <w:rPr>
           <w:sz w:val="21"/>
         </w:rPr>
-        <w:t>• Implemented advanced visualizations including contribution heatmaps and developer personas.</w:t>
+        <w:t xml:space="preserve"> • Implemented advanced visualizations including contribution heatmaps and developer personas.</w:t>
       </w:r>
     </w:p>
     <w:p>
       <w:pPr>
-        <w:spacing w:before="0" w:after="60" w:lineRule="exact" w:line="280"/>
+        <w:keepNext/>
+        <w:spacing w:before="0" w:after="40" w:lineRule="exact" w:line="260"/>
         <w:ind w:left="288" w:hanging="216"/>
       </w:pPr>
       <w:r>
@@ -1085,12 +1301,12 @@
         <w:rPr>
           <w:sz w:val="21"/>
         </w:rPr>
-        <w:t>• Created customizable dev card generator with 15+ themes and GitHub battles feature.</w:t>
+        <w:t xml:space="preserve"> • Created customizable dev card generator with 15+ themes and GitHub battles feature.</w:t>
       </w:r>
     </w:p>
     <w:p>
       <w:pPr>
-        <w:spacing w:before="0" w:after="60" w:lineRule="exact" w:line="280"/>
+        <w:spacing w:before="0" w:after="40" w:lineRule="exact" w:line="260"/>
         <w:ind w:left="288" w:hanging="216"/>
       </w:pPr>
       <w:r>
@@ -1103,17 +1319,18 @@
         <w:rPr>
           <w:sz w:val="21"/>
         </w:rPr>
-        <w:t>• Integrated GitHub API with higher rate limits and detailed contribution analysis.</w:t>
+        <w:t xml:space="preserve"> • Integrated GitHub API with higher rate limits and detailed contribution analysis.</w:t>
       </w:r>
     </w:p>
     <w:p>
       <w:pPr>
-        <w:spacing w:after="120"/>
+        <w:spacing w:after="60"/>
       </w:pPr>
     </w:p>
     <w:p>
       <w:pPr>
-        <w:spacing w:before="0" w:after="80" w:lineRule="exact" w:line="280"/>
+        <w:keepNext/>
+        <w:spacing w:before="0" w:after="60" w:lineRule="exact" w:line="260"/>
         <w:ind w:left="0"/>
       </w:pPr>
       <w:r>
@@ -1128,7 +1345,7 @@
     </w:p>
     <w:p>
       <w:pPr>
-        <w:spacing w:before="0" w:after="60" w:lineRule="exact" w:line="240"/>
+        <w:spacing w:before="0" w:after="40" w:lineRule="exact" w:line="220"/>
       </w:pPr>
       <w:hyperlink r:id="rId17">
         <w:r>
@@ -1136,16 +1353,16 @@
             <w:color w:val="0563C1"/>
             <w:u w:val="single"/>
           </w:rPr>
-          <w:t>Demo</w:t>
+          <w:t>Live</w:t>
         </w:r>
       </w:hyperlink>
       <w:r>
         <w:rPr>
           <w:b w:val="0"/>
           <w:i w:val="0"/>
-          <w:sz w:val="21"/>
+          <w:sz w:val="20"/>
         </w:rPr>
-        <w:t xml:space="preserve"> │ </w:t>
+        <w:t xml:space="preserve"> | </w:t>
       </w:r>
       <w:hyperlink r:id="rId18">
         <w:r>
@@ -1159,7 +1376,8 @@
     </w:p>
     <w:p>
       <w:pPr>
-        <w:spacing w:before="0" w:after="60" w:lineRule="exact" w:line="280"/>
+        <w:keepNext/>
+        <w:spacing w:before="0" w:after="40" w:lineRule="exact" w:line="260"/>
         <w:ind w:left="288" w:hanging="216"/>
       </w:pPr>
       <w:r>
@@ -1172,12 +1390,13 @@
         <w:rPr>
           <w:sz w:val="21"/>
         </w:rPr>
-        <w:t>• Developed full-stack AI image processing SaaS with Next.js 14, TypeScript, and MongoDB.</w:t>
+        <w:t xml:space="preserve"> • Developed full-stack AI image processing SaaS with Next.js 14, TypeScript, and MongoDB.</w:t>
       </w:r>
     </w:p>
     <w:p>
       <w:pPr>
-        <w:spacing w:before="0" w:after="60" w:lineRule="exact" w:line="280"/>
+        <w:keepNext/>
+        <w:spacing w:before="0" w:after="40" w:lineRule="exact" w:line="260"/>
         <w:ind w:left="288" w:hanging="216"/>
       </w:pPr>
       <w:r>
@@ -1190,12 +1409,13 @@
         <w:rPr>
           <w:sz w:val="21"/>
         </w:rPr>
-        <w:t>• Implemented 5 AI features: restoration, recoloring, object removal, generative filling, background removal.</w:t>
+        <w:t xml:space="preserve"> • Implemented 5 AI features: restoration, recoloring, object removal, generative filling, background removal.</w:t>
       </w:r>
     </w:p>
     <w:p>
       <w:pPr>
-        <w:spacing w:before="0" w:after="60" w:lineRule="exact" w:line="280"/>
+        <w:keepNext/>
+        <w:spacing w:before="0" w:after="40" w:lineRule="exact" w:line="260"/>
         <w:ind w:left="288" w:hanging="216"/>
       </w:pPr>
       <w:r>
@@ -1208,12 +1428,12 @@
         <w:rPr>
           <w:sz w:val="21"/>
         </w:rPr>
-        <w:t>• Integrated Stripe payments, Clerk authentication, and Cloudinary cloud storage.</w:t>
+        <w:t xml:space="preserve"> • Integrated Stripe payments, Clerk authentication, and Cloudinary cloud storage.</w:t>
       </w:r>
     </w:p>
     <w:p>
       <w:pPr>
-        <w:spacing w:before="0" w:after="60" w:lineRule="exact" w:line="280"/>
+        <w:spacing w:before="0" w:after="40" w:lineRule="exact" w:line="260"/>
         <w:ind w:left="288" w:hanging="216"/>
       </w:pPr>
       <w:r>
@@ -1226,17 +1446,18 @@
         <w:rPr>
           <w:sz w:val="21"/>
         </w:rPr>
-        <w:t>• Built credits system and community showcase with responsive UI/UX design.</w:t>
+        <w:t xml:space="preserve"> • Built credits system and community showcase with responsive UI/UX design.</w:t>
       </w:r>
     </w:p>
     <w:p>
       <w:pPr>
-        <w:spacing w:after="120"/>
+        <w:spacing w:after="60"/>
       </w:pPr>
     </w:p>
     <w:p>
       <w:pPr>
-        <w:spacing w:before="0" w:after="80" w:lineRule="exact" w:line="280"/>
+        <w:keepNext/>
+        <w:spacing w:before="0" w:after="60" w:lineRule="exact" w:line="260"/>
         <w:ind w:left="0"/>
       </w:pPr>
       <w:r>
@@ -1251,7 +1472,7 @@
     </w:p>
     <w:p>
       <w:pPr>
-        <w:spacing w:before="0" w:after="60" w:lineRule="exact" w:line="240"/>
+        <w:spacing w:before="0" w:after="40" w:lineRule="exact" w:line="220"/>
       </w:pPr>
       <w:hyperlink r:id="rId19">
         <w:r>
@@ -1259,16 +1480,16 @@
             <w:color w:val="0563C1"/>
             <w:u w:val="single"/>
           </w:rPr>
-          <w:t>Demo</w:t>
+          <w:t>Live</w:t>
         </w:r>
       </w:hyperlink>
       <w:r>
         <w:rPr>
           <w:b w:val="0"/>
           <w:i w:val="0"/>
-          <w:sz w:val="21"/>
+          <w:sz w:val="20"/>
         </w:rPr>
-        <w:t xml:space="preserve"> │ </w:t>
+        <w:t xml:space="preserve"> | </w:t>
       </w:r>
       <w:hyperlink r:id="rId20">
         <w:r>
@@ -1282,7 +1503,8 @@
     </w:p>
     <w:p>
       <w:pPr>
-        <w:spacing w:before="0" w:after="60" w:lineRule="exact" w:line="280"/>
+        <w:keepNext/>
+        <w:spacing w:before="0" w:after="40" w:lineRule="exact" w:line="260"/>
         <w:ind w:left="288" w:hanging="216"/>
       </w:pPr>
       <w:r>
@@ -1295,12 +1517,13 @@
         <w:rPr>
           <w:sz w:val="21"/>
         </w:rPr>
-        <w:t>• Created modern portfolio using React 19, TypeScript, and Tailwind CSS v4.</w:t>
+        <w:t xml:space="preserve"> • Created modern portfolio using React 19, TypeScript, and Tailwind CSS v4.</w:t>
       </w:r>
     </w:p>
     <w:p>
       <w:pPr>
-        <w:spacing w:before="0" w:after="60" w:lineRule="exact" w:line="280"/>
+        <w:keepNext/>
+        <w:spacing w:before="0" w:after="40" w:lineRule="exact" w:line="260"/>
         <w:ind w:left="288" w:hanging="216"/>
       </w:pPr>
       <w:r>
@@ -1313,12 +1536,13 @@
         <w:rPr>
           <w:sz w:val="21"/>
         </w:rPr>
-        <w:t>• Implemented comprehensive theming system with dark mode and semantic color variables.</w:t>
+        <w:t xml:space="preserve"> • Implemented comprehensive theming system with dark mode and semantic color variables.</w:t>
       </w:r>
     </w:p>
     <w:p>
       <w:pPr>
-        <w:spacing w:before="0" w:after="60" w:lineRule="exact" w:line="280"/>
+        <w:keepNext/>
+        <w:spacing w:before="0" w:after="40" w:lineRule="exact" w:line="260"/>
         <w:ind w:left="288" w:hanging="216"/>
       </w:pPr>
       <w:r>
@@ -1331,12 +1555,12 @@
         <w:rPr>
           <w:sz w:val="21"/>
         </w:rPr>
-        <w:t>• Added smooth animations, scroll effects, and responsive design principles.</w:t>
+        <w:t xml:space="preserve"> • Added smooth animations, scroll effects, and responsive design principles.</w:t>
       </w:r>
     </w:p>
     <w:p>
       <w:pPr>
-        <w:spacing w:before="0" w:after="60" w:lineRule="exact" w:line="280"/>
+        <w:spacing w:before="0" w:after="40" w:lineRule="exact" w:line="260"/>
         <w:ind w:left="288" w:hanging="216"/>
       </w:pPr>
       <w:r>
@@ -1349,17 +1573,18 @@
         <w:rPr>
           <w:sz w:val="21"/>
         </w:rPr>
-        <w:t>• Showcases professional experience, technical skills, and project portfolio effectively.</w:t>
+        <w:t xml:space="preserve"> • Showcases professional experience, technical skills, and project portfolio effectively.</w:t>
       </w:r>
     </w:p>
     <w:p>
       <w:pPr>
-        <w:spacing w:after="120"/>
+        <w:spacing w:after="60"/>
       </w:pPr>
     </w:p>
     <w:p>
       <w:pPr>
-        <w:spacing w:before="0" w:after="80" w:lineRule="exact" w:line="280"/>
+        <w:keepNext/>
+        <w:spacing w:before="0" w:after="60" w:lineRule="exact" w:line="260"/>
         <w:ind w:left="0"/>
       </w:pPr>
       <w:r>
@@ -1374,40 +1599,24 @@
     </w:p>
     <w:p>
       <w:pPr>
-        <w:spacing w:before="0" w:after="60" w:lineRule="exact" w:line="240"/>
+        <w:spacing w:before="0" w:after="40" w:lineRule="exact" w:line="220"/>
       </w:pPr>
-      <w:r>
-        <w:rPr>
-          <w:b w:val="0"/>
-          <w:i w:val="0"/>
-          <w:sz w:val="21"/>
-        </w:rPr>
-        <w:t xml:space="preserve">React 19: </w:t>
-      </w:r>
       <w:hyperlink r:id="rId21">
         <w:r>
           <w:rPr>
             <w:color w:val="0563C1"/>
             <w:u w:val="single"/>
           </w:rPr>
-          <w:t>Demo</w:t>
+          <w:t>React 19</w:t>
         </w:r>
       </w:hyperlink>
       <w:r>
         <w:rPr>
           <w:b w:val="0"/>
           <w:i w:val="0"/>
-          <w:sz w:val="21"/>
+          <w:sz w:val="20"/>
         </w:rPr>
-        <w:t xml:space="preserve"> │ </w:t>
-      </w:r>
-      <w:r>
-        <w:rPr>
-          <w:b w:val="0"/>
-          <w:i w:val="0"/>
-          <w:sz w:val="21"/>
-        </w:rPr>
-        <w:t xml:space="preserve">Next.js 15: </w:t>
+        <w:t xml:space="preserve"> | </w:t>
       </w:r>
       <w:hyperlink r:id="rId22">
         <w:r>
@@ -1415,13 +1624,48 @@
             <w:color w:val="0563C1"/>
             <w:u w:val="single"/>
           </w:rPr>
-          <w:t>Demo</w:t>
+          <w:t>Next.js 16 Full-Stack</w:t>
+        </w:r>
+      </w:hyperlink>
+      <w:r>
+        <w:rPr>
+          <w:b w:val="0"/>
+          <w:i w:val="0"/>
+          <w:sz w:val="20"/>
+        </w:rPr>
+        <w:t xml:space="preserve"> | </w:t>
+      </w:r>
+      <w:hyperlink r:id="rId23">
+        <w:r>
+          <w:rPr>
+            <w:color w:val="0563C1"/>
+            <w:u w:val="single"/>
+          </w:rPr>
+          <w:t>Next.js 16 Backend</w:t>
+        </w:r>
+      </w:hyperlink>
+      <w:r>
+        <w:rPr>
+          <w:b w:val="0"/>
+          <w:i w:val="0"/>
+          <w:sz w:val="20"/>
+        </w:rPr>
+        <w:t xml:space="preserve"> | </w:t>
+      </w:r>
+      <w:hyperlink r:id="rId24">
+        <w:r>
+          <w:rPr>
+            <w:color w:val="0563C1"/>
+            <w:u w:val="single"/>
+          </w:rPr>
+          <w:t>Express TypeScript</w:t>
         </w:r>
       </w:hyperlink>
     </w:p>
     <w:p>
       <w:pPr>
-        <w:spacing w:before="0" w:after="60" w:lineRule="exact" w:line="280"/>
+        <w:keepNext/>
+        <w:spacing w:before="0" w:after="40" w:lineRule="exact" w:line="260"/>
         <w:ind w:left="288" w:hanging="216"/>
       </w:pPr>
       <w:r>
@@ -1434,12 +1678,13 @@
         <w:rPr>
           <w:sz w:val="21"/>
         </w:rPr>
-        <w:t>• Built production-ready templates with React 19/Next.js 15, TypeScript, and Tailwind CSS v4.</w:t>
+        <w:t xml:space="preserve"> • Built 4 production-ready templates: React 19, Next.js 16 full-stack/backend, and Express.js with TypeScript.</w:t>
       </w:r>
     </w:p>
     <w:p>
       <w:pPr>
-        <w:spacing w:before="0" w:after="60" w:lineRule="exact" w:line="280"/>
+        <w:keepNext/>
+        <w:spacing w:before="0" w:after="40" w:lineRule="exact" w:line="260"/>
         <w:ind w:left="288" w:hanging="216"/>
       </w:pPr>
       <w:r>
@@ -1452,12 +1697,13 @@
         <w:rPr>
           <w:sz w:val="21"/>
         </w:rPr>
-        <w:t>• Configured comprehensive development tooling: ESLint, Prettier, Husky pre-commit hooks.</w:t>
+        <w:t xml:space="preserve"> • Implemented auto-generated OpenAPI documentation with type-safe API clients and zero-configuration discovery.</w:t>
       </w:r>
     </w:p>
     <w:p>
       <w:pPr>
-        <w:spacing w:before="0" w:after="60" w:lineRule="exact" w:line="280"/>
+        <w:keepNext/>
+        <w:spacing w:before="0" w:after="40" w:lineRule="exact" w:line="260"/>
         <w:ind w:left="288" w:hanging="216"/>
       </w:pPr>
       <w:r>
@@ -1470,12 +1716,13 @@
         <w:rPr>
           <w:sz w:val="21"/>
         </w:rPr>
-        <w:t>• Implemented semantic theming systems with dark mode support out of the box.</w:t>
+        <w:t xml:space="preserve"> • Created comprehensive developer tooling: ESLint, Prettier, Husky, decorator-based Swagger, and form validation with Zod.</w:t>
       </w:r>
     </w:p>
     <w:p>
       <w:pPr>
-        <w:spacing w:before="0" w:after="60" w:lineRule="exact" w:line="280"/>
+        <w:keepNext/>
+        <w:spacing w:before="0" w:after="40" w:lineRule="exact" w:line="260"/>
         <w:ind w:left="288" w:hanging="216"/>
       </w:pPr>
       <w:r>
@@ -1488,12 +1735,31 @@
         <w:rPr>
           <w:sz w:val="21"/>
         </w:rPr>
-        <w:t>• Templates adopted by developers for modern project foundations with best practices.</w:t>
+        <w:t xml:space="preserve"> • Features semantic theming systems, dark mode support, React Query integration, and MongoDB integration.</w:t>
       </w:r>
     </w:p>
     <w:p>
       <w:pPr>
-        <w:spacing w:before="240" w:after="120"/>
+        <w:spacing w:before="0" w:after="40" w:lineRule="exact" w:line="260"/>
+        <w:ind w:left="288" w:hanging="216"/>
+      </w:pPr>
+      <w:r>
+        <w:rPr>
+          <w:color w:val="1F4E79"/>
+          <w:sz w:val="20"/>
+        </w:rPr>
+      </w:r>
+      <w:r>
+        <w:rPr>
+          <w:sz w:val="21"/>
+        </w:rPr>
+        <w:t xml:space="preserve"> • Templates adopted by developers for modern project foundations with optimized production deployments.</w:t>
+      </w:r>
+    </w:p>
+    <w:p>
+      <w:pPr>
+        <w:keepNext/>
+        <w:spacing w:before="200" w:after="120"/>
         <w:ind w:left="0" w:right="0"/>
         <w:jc w:val="left"/>
       </w:pPr>
@@ -1501,7 +1767,7 @@
         <w:rPr>
           <w:b/>
           <w:color w:val="1F4E79"/>
-          <w:sz w:val="26"/>
+          <w:sz w:val="25"/>
           <w:u w:val="single"/>
         </w:rPr>
         <w:t>Skills</w:t>
@@ -1509,219 +1775,220 @@
     </w:p>
     <w:p>
       <w:pPr>
-        <w:spacing w:before="0" w:after="160"/>
+        <w:spacing w:before="0" w:after="120"/>
       </w:pPr>
       <w:r>
         <w:rPr>
           <w:color w:val="E0E0E0"/>
           <w:sz w:val="16"/>
         </w:rPr>
-        <w:t>━━━━━━━━━━━━━━━━━━━━━━━━━━━━━━━━━━━━━━━━━━━━━━━━━━━━━━━━━━━━</w:t>
+        <w:t>━━━━━━━━━━━━━━━━━━━━━━━━━━━━━━━━━━━━━━━━━━━━━━━━━━</w:t>
       </w:r>
     </w:p>
     <w:p>
       <w:pPr>
-        <w:spacing w:before="40" w:after="120" w:lineRule="exact" w:line="280"/>
+        <w:spacing w:before="20" w:after="60" w:lineRule="exact" w:line="240"/>
       </w:pPr>
       <w:r>
         <w:rPr>
           <w:b/>
           <w:color w:val="1F4E79"/>
-          <w:sz w:val="21"/>
+          <w:sz w:val="20"/>
         </w:rPr>
         <w:t xml:space="preserve">Languages: </w:t>
       </w:r>
       <w:r>
         <w:rPr>
           <w:color w:val="2C3E50"/>
-          <w:sz w:val="21"/>
+          <w:sz w:val="20"/>
         </w:rPr>
         <w:t>HTML, CSS, JavaScript, TypeScript, SQL, Bash, C, Python</w:t>
       </w:r>
     </w:p>
     <w:p>
       <w:pPr>
-        <w:spacing w:before="40" w:after="120" w:lineRule="exact" w:line="280"/>
+        <w:spacing w:before="20" w:after="60" w:lineRule="exact" w:line="240"/>
       </w:pPr>
       <w:r>
         <w:rPr>
           <w:b/>
           <w:color w:val="1F4E79"/>
-          <w:sz w:val="21"/>
+          <w:sz w:val="20"/>
         </w:rPr>
         <w:t xml:space="preserve">Frameworks &amp; Libraries: </w:t>
       </w:r>
       <w:r>
         <w:rPr>
           <w:color w:val="2C3E50"/>
-          <w:sz w:val="21"/>
+          <w:sz w:val="20"/>
         </w:rPr>
-        <w:t>React.js, Next.js, Vite.js, Redux, Context API, Express.js, Mongoose</w:t>
+        <w:t>React 19, Next.js, Vite, Redux, Context API, Express.js, Mongoose, TanStack Router</w:t>
       </w:r>
     </w:p>
     <w:p>
       <w:pPr>
-        <w:spacing w:before="40" w:after="120" w:lineRule="exact" w:line="280"/>
+        <w:spacing w:before="20" w:after="60" w:lineRule="exact" w:line="240"/>
       </w:pPr>
       <w:r>
         <w:rPr>
           <w:b/>
           <w:color w:val="1F4E79"/>
-          <w:sz w:val="21"/>
+          <w:sz w:val="20"/>
         </w:rPr>
         <w:t xml:space="preserve">UI Libraries: </w:t>
       </w:r>
       <w:r>
         <w:rPr>
           <w:color w:val="2C3E50"/>
-          <w:sz w:val="21"/>
+          <w:sz w:val="20"/>
         </w:rPr>
-        <w:t>Material-UI, Tailwind CSS, Bootstrap, Shadcn‑UI, Styled Components</w:t>
+        <w:t>Material-UI, Tailwind CSS v4, Bootstrap, Shadcn/UI, Styled Components</w:t>
       </w:r>
     </w:p>
     <w:p>
       <w:pPr>
-        <w:spacing w:before="40" w:after="120" w:lineRule="exact" w:line="280"/>
+        <w:spacing w:before="20" w:after="60" w:lineRule="exact" w:line="240"/>
       </w:pPr>
       <w:r>
         <w:rPr>
           <w:b/>
           <w:color w:val="1F4E79"/>
-          <w:sz w:val="21"/>
+          <w:sz w:val="20"/>
         </w:rPr>
         <w:t xml:space="preserve">State Management &amp; Data Fetching: </w:t>
       </w:r>
       <w:r>
         <w:rPr>
           <w:color w:val="2C3E50"/>
-          <w:sz w:val="21"/>
+          <w:sz w:val="20"/>
         </w:rPr>
-        <w:t>React Query, Redux, Context API, Apollo Client</w:t>
+        <w:t>TanStack Query, React Query, Redux, Context API, Apollo Client</w:t>
       </w:r>
     </w:p>
     <w:p>
       <w:pPr>
-        <w:spacing w:before="40" w:after="120" w:lineRule="exact" w:line="280"/>
+        <w:spacing w:before="20" w:after="60" w:lineRule="exact" w:line="240"/>
       </w:pPr>
       <w:r>
         <w:rPr>
           <w:b/>
           <w:color w:val="1F4E79"/>
-          <w:sz w:val="21"/>
+          <w:sz w:val="20"/>
         </w:rPr>
         <w:t xml:space="preserve">Mobile / Cross‑Platform: </w:t>
       </w:r>
       <w:r>
         <w:rPr>
           <w:color w:val="2C3E50"/>
-          <w:sz w:val="21"/>
+          <w:sz w:val="20"/>
         </w:rPr>
         <w:t>Capacitor (iOS/Android, biometric auth)</w:t>
       </w:r>
     </w:p>
     <w:p>
       <w:pPr>
-        <w:spacing w:before="40" w:after="120" w:lineRule="exact" w:line="280"/>
+        <w:spacing w:before="20" w:after="60" w:lineRule="exact" w:line="240"/>
       </w:pPr>
       <w:r>
         <w:rPr>
           <w:b/>
           <w:color w:val="1F4E79"/>
-          <w:sz w:val="21"/>
+          <w:sz w:val="20"/>
         </w:rPr>
         <w:t xml:space="preserve">API &amp; Auth: </w:t>
       </w:r>
       <w:r>
         <w:rPr>
           <w:color w:val="2C3E50"/>
-          <w:sz w:val="21"/>
+          <w:sz w:val="20"/>
         </w:rPr>
-        <w:t>REST, GraphQL, JWT, Clerk, bcrypt, dotenv, cors, Webhooks, Axios, Fetch API</w:t>
+        <w:t>REST APIs, OpenAPI, Swagger, GraphQL, JWT Authentication, Clerk, bcrypt, dotenv, cors, Webhooks, Axios, Fetch API</w:t>
       </w:r>
     </w:p>
     <w:p>
       <w:pPr>
-        <w:spacing w:before="40" w:after="120" w:lineRule="exact" w:line="280"/>
+        <w:spacing w:before="20" w:after="60" w:lineRule="exact" w:line="240"/>
       </w:pPr>
       <w:r>
         <w:rPr>
           <w:b/>
           <w:color w:val="1F4E79"/>
-          <w:sz w:val="21"/>
+          <w:sz w:val="20"/>
         </w:rPr>
         <w:t xml:space="preserve">Databases: </w:t>
       </w:r>
       <w:r>
         <w:rPr>
           <w:color w:val="2C3E50"/>
-          <w:sz w:val="21"/>
+          <w:sz w:val="20"/>
         </w:rPr>
         <w:t>MongoDB, PostgreSQL</w:t>
       </w:r>
     </w:p>
     <w:p>
       <w:pPr>
-        <w:spacing w:before="40" w:after="120" w:lineRule="exact" w:line="280"/>
+        <w:spacing w:before="20" w:after="60" w:lineRule="exact" w:line="240"/>
       </w:pPr>
       <w:r>
         <w:rPr>
           <w:b/>
           <w:color w:val="1F4E79"/>
-          <w:sz w:val="21"/>
+          <w:sz w:val="20"/>
         </w:rPr>
         <w:t xml:space="preserve">Testing: </w:t>
       </w:r>
       <w:r>
         <w:rPr>
           <w:color w:val="2C3E50"/>
-          <w:sz w:val="21"/>
+          <w:sz w:val="20"/>
         </w:rPr>
         <w:t>Jest, Jasmine, Cypress, Playwright</w:t>
       </w:r>
     </w:p>
     <w:p>
       <w:pPr>
-        <w:spacing w:before="40" w:after="120" w:lineRule="exact" w:line="280"/>
+        <w:spacing w:before="20" w:after="60" w:lineRule="exact" w:line="240"/>
       </w:pPr>
       <w:r>
         <w:rPr>
           <w:b/>
           <w:color w:val="1F4E79"/>
-          <w:sz w:val="21"/>
+          <w:sz w:val="20"/>
         </w:rPr>
         <w:t xml:space="preserve">CI/CD &amp; DevOps: </w:t>
       </w:r>
       <w:r>
         <w:rPr>
           <w:color w:val="2C3E50"/>
-          <w:sz w:val="21"/>
+          <w:sz w:val="20"/>
         </w:rPr>
-        <w:t>Git, GitHub, GitHub Actions, CircleCI, Netlify, Heroku, Vercel, AWS</w:t>
+        <w:t>Git, GitHub, GitHub Actions, CI/CD Workflows, CircleCI, Netlify, Heroku, Vercel, AWS, Husky, ESLint, Prettier</w:t>
       </w:r>
     </w:p>
     <w:p>
       <w:pPr>
-        <w:spacing w:before="40" w:after="120" w:lineRule="exact" w:line="280"/>
+        <w:spacing w:before="20" w:after="60" w:lineRule="exact" w:line="240"/>
       </w:pPr>
       <w:r>
         <w:rPr>
           <w:b/>
           <w:color w:val="1F4E79"/>
-          <w:sz w:val="21"/>
+          <w:sz w:val="20"/>
         </w:rPr>
         <w:t xml:space="preserve">Other Services &amp; Tools: </w:t>
       </w:r>
       <w:r>
         <w:rPr>
           <w:color w:val="2C3E50"/>
-          <w:sz w:val="21"/>
+          <w:sz w:val="20"/>
         </w:rPr>
         <w:t>Stripe, Cloudinary, Scroll‑Lock</w:t>
       </w:r>
     </w:p>
     <w:p>
       <w:pPr>
-        <w:spacing w:before="240" w:after="120"/>
+        <w:keepNext/>
+        <w:spacing w:before="200" w:after="120"/>
         <w:ind w:left="0" w:right="0"/>
         <w:jc w:val="left"/>
       </w:pPr>
@@ -1729,7 +1996,7 @@
         <w:rPr>
           <w:b/>
           <w:color w:val="1F4E79"/>
-          <w:sz w:val="26"/>
+          <w:sz w:val="25"/>
           <w:u w:val="single"/>
         </w:rPr>
         <w:t>Languages</w:t>
@@ -1737,47 +2004,47 @@
     </w:p>
     <w:p>
       <w:pPr>
-        <w:spacing w:before="0" w:after="160"/>
+        <w:spacing w:before="0" w:after="120"/>
       </w:pPr>
       <w:r>
         <w:rPr>
           <w:color w:val="E0E0E0"/>
           <w:sz w:val="16"/>
         </w:rPr>
-        <w:t>━━━━━━━━━━━━━━━━━━━━━━━━━━━━━━━━━━━━━━━━━━━━━━━━━━━━━━━━━━━━</w:t>
+        <w:t>━━━━━━━━━━━━━━━━━━━━━━━━━━━━━━━━━━━━━━━━━━━━━━━━━━</w:t>
       </w:r>
     </w:p>
     <w:p>
       <w:pPr>
-        <w:spacing w:before="0" w:after="80" w:lineRule="exact" w:line="280"/>
+        <w:spacing w:before="0" w:after="60" w:lineRule="exact" w:line="260"/>
         <w:ind w:left="0"/>
       </w:pPr>
       <w:r>
         <w:rPr>
           <w:b w:val="0"/>
           <w:i w:val="0"/>
-          <w:sz w:val="21"/>
+          <w:sz w:val="20"/>
         </w:rPr>
-        <w:t>🌍 Arabic — Native</w:t>
+        <w:t>Arabic — Native</w:t>
       </w:r>
     </w:p>
     <w:p>
       <w:pPr>
-        <w:spacing w:before="0" w:after="80" w:lineRule="exact" w:line="280"/>
+        <w:spacing w:before="0" w:after="60" w:lineRule="exact" w:line="260"/>
         <w:ind w:left="0"/>
       </w:pPr>
       <w:r>
         <w:rPr>
           <w:b w:val="0"/>
           <w:i w:val="0"/>
-          <w:sz w:val="21"/>
+          <w:sz w:val="20"/>
         </w:rPr>
-        <w:t>🌍 English — C1</w:t>
+        <w:t>English — C1</w:t>
       </w:r>
     </w:p>
     <w:sectPr>
       <w:pgSz w:w="12240" w:h="15840"/>
-      <w:pgMar w:top="1008" w:right="1152" w:bottom="1008" w:left="1152" w:header="720" w:footer="720" w:gutter="0"/>
+      <w:pgMar w:top="720" w:right="1008" w:bottom="720" w:left="1008" w:header="720" w:footer="720" w:gutter="0"/>
       <w:cols w:space="720"/>
       <w:docGrid w:linePitch="360"/>
     </w:sectPr>
@@ -2149,7 +2416,7 @@
     <w:qFormat/>
     <w:rsid w:val="00FC693F"/>
     <w:pPr>
-      <w:spacing w:before="0" w:after="60" w:lineRule="exact" w:line="240"/>
+      <w:spacing w:before="0" w:after="60" w:lineRule="exact" w:line="250"/>
     </w:pPr>
     <w:rPr>
       <w:rFonts w:ascii="Arial" w:hAnsi="Arial"/>

</xml_diff>